<commit_message>
Lower Ijazah exam pass threshold to 70% and add Musterloesung answer keys
Pass threshold changed from 95% to 70% (Note 3) per user request, with a
full 6-grade Notenschluessel (1 sehr gut .. 6 ungenuegend) replacing the
previous 3-row table.

Added model-answer keys (Musterloesung) for both exam variants:
ijazah_answers.py holds the 100 canonical answers, build_loesungen.py
matches each variant's own question order (Hauptpruefung and the
reshuffled Vorbereitungspruefung) to the correct answer via exact text
matching, so both Loesungsblaetter line up with their respective exam's
numbering.

Co-Authored-By: Claude Sonnet 5 <noreply@anthropic.com>
Claude-Session: https://claude.ai/code/session_01Fp7ubAjun2K431oDRyGdEx
</commit_message>
<xml_diff>
--- a/aqidah_ijazah_pruefung_hauptpruefung.docx
+++ b/aqidah_ijazah_pruefung_hauptpruefung.docx
@@ -526,13 +526,13 @@
         <w:t xml:space="preserve"> </w:t>
       </w:r>
       <w:r>
-        <w:t xml:space="preserve">95 %</w:t>
-      </w:r>
-      <w:r>
-        <w:t xml:space="preserve"> </w:t>
-      </w:r>
-      <w:r>
-        <w:t xml:space="preserve">(mindestens 426 Punkte)</w:t>
+        <w:t xml:space="preserve">70 %</w:t>
+      </w:r>
+      <w:r>
+        <w:t xml:space="preserve"> </w:t>
+      </w:r>
+      <w:r>
+        <w:t xml:space="preserve">/ Note 3 (mindestens 314 Punkte)</w:t>
       </w:r>
     </w:p>
     <w:tbl>
@@ -584,7 +584,7 @@
               <w:jc w:val="left"/>
             </w:pPr>
             <w:r>
-              <w:t xml:space="preserve">Bewertung</w:t>
+              <w:t xml:space="preserve">Note</w:t>
             </w:r>
           </w:p>
         </w:tc>
@@ -610,7 +610,7 @@
               <w:jc w:val="left"/>
             </w:pPr>
             <w:r>
-              <w:t xml:space="preserve">98–100 %</w:t>
+              <w:t xml:space="preserve">92–100 %</w:t>
             </w:r>
           </w:p>
         </w:tc>
@@ -622,7 +622,7 @@
               <w:jc w:val="left"/>
             </w:pPr>
             <w:r>
-              <w:t xml:space="preserve">440–448</w:t>
+              <w:t xml:space="preserve">413–448</w:t>
             </w:r>
           </w:p>
         </w:tc>
@@ -634,7 +634,7 @@
               <w:jc w:val="left"/>
             </w:pPr>
             <w:r>
-              <w:t xml:space="preserve">ausgezeichnet</w:t>
+              <w:t xml:space="preserve">1 · sehr gut</w:t>
             </w:r>
           </w:p>
         </w:tc>
@@ -660,7 +660,7 @@
               <w:jc w:val="left"/>
             </w:pPr>
             <w:r>
-              <w:t xml:space="preserve">95–97 %</w:t>
+              <w:t xml:space="preserve">81–91 %</w:t>
             </w:r>
           </w:p>
         </w:tc>
@@ -672,7 +672,7 @@
               <w:jc w:val="left"/>
             </w:pPr>
             <w:r>
-              <w:t xml:space="preserve">426–434</w:t>
+              <w:t xml:space="preserve">363–412</w:t>
             </w:r>
           </w:p>
         </w:tc>
@@ -684,7 +684,7 @@
               <w:jc w:val="left"/>
             </w:pPr>
             <w:r>
-              <w:t xml:space="preserve">sehr gut</w:t>
+              <w:t xml:space="preserve">2 · gut</w:t>
             </w:r>
           </w:p>
         </w:tc>
@@ -710,7 +710,7 @@
               <w:jc w:val="left"/>
             </w:pPr>
             <w:r>
-              <w:t xml:space="preserve">unter 95 %</w:t>
+              <w:t xml:space="preserve">70–80 %</w:t>
             </w:r>
           </w:p>
         </w:tc>
@@ -722,7 +722,7 @@
               <w:jc w:val="left"/>
             </w:pPr>
             <w:r>
-              <w:t xml:space="preserve">0–425</w:t>
+              <w:t xml:space="preserve">314–362</w:t>
             </w:r>
           </w:p>
         </w:tc>
@@ -734,7 +734,7 @@
               <w:jc w:val="left"/>
             </w:pPr>
             <w:r>
-              <w:t xml:space="preserve">—</w:t>
+              <w:t xml:space="preserve">3 · befriedigend</w:t>
             </w:r>
           </w:p>
         </w:tc>
@@ -746,7 +746,157 @@
               <w:jc w:val="left"/>
             </w:pPr>
             <w:r>
-              <w:t xml:space="preserve">nicht bestanden (Wiederholung)</w:t>
+              <w:t xml:space="preserve">bestanden</w:t>
+            </w:r>
+          </w:p>
+        </w:tc>
+      </w:tr>
+      <w:tr>
+        <w:tc>
+          <w:tcPr/>
+          <w:p>
+            <w:pPr>
+              <w:pStyle w:val="Compact"/>
+              <w:jc w:val="left"/>
+            </w:pPr>
+            <w:r>
+              <w:t xml:space="preserve">50–69 %</w:t>
+            </w:r>
+          </w:p>
+        </w:tc>
+        <w:tc>
+          <w:tcPr/>
+          <w:p>
+            <w:pPr>
+              <w:pStyle w:val="Compact"/>
+              <w:jc w:val="left"/>
+            </w:pPr>
+            <w:r>
+              <w:t xml:space="preserve">224–313</w:t>
+            </w:r>
+          </w:p>
+        </w:tc>
+        <w:tc>
+          <w:tcPr/>
+          <w:p>
+            <w:pPr>
+              <w:pStyle w:val="Compact"/>
+              <w:jc w:val="left"/>
+            </w:pPr>
+            <w:r>
+              <w:t xml:space="preserve">4 · ausreichend</w:t>
+            </w:r>
+          </w:p>
+        </w:tc>
+        <w:tc>
+          <w:tcPr/>
+          <w:p>
+            <w:pPr>
+              <w:pStyle w:val="Compact"/>
+              <w:jc w:val="left"/>
+            </w:pPr>
+            <w:r>
+              <w:t xml:space="preserve">nicht bestanden</w:t>
+            </w:r>
+          </w:p>
+        </w:tc>
+      </w:tr>
+      <w:tr>
+        <w:tc>
+          <w:tcPr/>
+          <w:p>
+            <w:pPr>
+              <w:pStyle w:val="Compact"/>
+              <w:jc w:val="left"/>
+            </w:pPr>
+            <w:r>
+              <w:t xml:space="preserve">30–49 %</w:t>
+            </w:r>
+          </w:p>
+        </w:tc>
+        <w:tc>
+          <w:tcPr/>
+          <w:p>
+            <w:pPr>
+              <w:pStyle w:val="Compact"/>
+              <w:jc w:val="left"/>
+            </w:pPr>
+            <w:r>
+              <w:t xml:space="preserve">135–223</w:t>
+            </w:r>
+          </w:p>
+        </w:tc>
+        <w:tc>
+          <w:tcPr/>
+          <w:p>
+            <w:pPr>
+              <w:pStyle w:val="Compact"/>
+              <w:jc w:val="left"/>
+            </w:pPr>
+            <w:r>
+              <w:t xml:space="preserve">5 · mangelhaft</w:t>
+            </w:r>
+          </w:p>
+        </w:tc>
+        <w:tc>
+          <w:tcPr/>
+          <w:p>
+            <w:pPr>
+              <w:pStyle w:val="Compact"/>
+              <w:jc w:val="left"/>
+            </w:pPr>
+            <w:r>
+              <w:t xml:space="preserve">nicht bestanden</w:t>
+            </w:r>
+          </w:p>
+        </w:tc>
+      </w:tr>
+      <w:tr>
+        <w:tc>
+          <w:tcPr/>
+          <w:p>
+            <w:pPr>
+              <w:pStyle w:val="Compact"/>
+              <w:jc w:val="left"/>
+            </w:pPr>
+            <w:r>
+              <w:t xml:space="preserve">unter 30 %</w:t>
+            </w:r>
+          </w:p>
+        </w:tc>
+        <w:tc>
+          <w:tcPr/>
+          <w:p>
+            <w:pPr>
+              <w:pStyle w:val="Compact"/>
+              <w:jc w:val="left"/>
+            </w:pPr>
+            <w:r>
+              <w:t xml:space="preserve">0–134</w:t>
+            </w:r>
+          </w:p>
+        </w:tc>
+        <w:tc>
+          <w:tcPr/>
+          <w:p>
+            <w:pPr>
+              <w:pStyle w:val="Compact"/>
+              <w:jc w:val="left"/>
+            </w:pPr>
+            <w:r>
+              <w:t xml:space="preserve">6 · ungenügend</w:t>
+            </w:r>
+          </w:p>
+        </w:tc>
+        <w:tc>
+          <w:tcPr/>
+          <w:p>
+            <w:pPr>
+              <w:pStyle w:val="Compact"/>
+              <w:jc w:val="left"/>
+            </w:pPr>
+            <w:r>
+              <w:t xml:space="preserve">nicht bestanden</w:t>
             </w:r>
           </w:p>
         </w:tc>

</xml_diff>